<commit_message>
feat(entrega2): cuentas del CADUS y de los delegados, PR de pruebas fusionadas y paquete final con CADUS.rem
- Modelo de cuentas: una cuenta unica del CADUS (dcadus@us.es, toda la Ejecutiva) y una por delegado con su correo de alumno
- crear_cuenta_cadus.php, aplicar_usuarios.php exige @alum.us.es a los delegados, usuarios-reales.csv fuera de Git
- REM 2.0 regenerado (CADUS.rem) y actualizado; sin (null) en los pasos de los casos de uso
- Seguridad: solo la Ejecutiva y el administrador pueden crear delegaciones (create_cadus_delegacions)
- Documento y PDF de la entrega actualizados; paquete docs/entrega/entrega2 con CADUS.rem
- Tareas E2 del Project al dia (PR 32 y 33 fusionadas)

Co-Authored-By: Claude Sonnet 5.5 <noreply@anthropic.com>
</commit_message>
<xml_diff>
--- a/docs/entrega/Entrega2-CMS-CADUS.docx
+++ b/docs/entrega/Entrega2-CMS-CADUS.docx
@@ -10476,7 +10476,7 @@
               <w:rPr>
                 <w:sz w:val="16"/>
               </w:rPr>
-              <w:t>Hecho (PR #32)</w:t>
+              <w:t>Hecho</w:t>
             </w:r>
           </w:p>
         </w:tc>
@@ -11192,7 +11192,7 @@
               <w:rPr>
                 <w:sz w:val="16"/>
               </w:rPr>
-              <w:t>Pendiente</w:t>
+              <w:t>Hecho</w:t>
             </w:r>
           </w:p>
         </w:tc>
@@ -11388,7 +11388,7 @@
           <w:b w:val="0"/>
           <w:i/>
         </w:rPr>
-        <w:t>Resultado: 29 de 29 SP completados (100 %). De las 20 tareas E2-xx de documentación y entrega, nueve están hechas (E2-05 con la salvedad de que el burndown no se actualizó a diario), dos parciales, dos en curso y siete pendientes por depender de datos del cliente o del cierre de la entrega (sección 8). El reparto final de puntos fue de 5 a 7 SP por persona.</w:t>
+        <w:t>Resultado: 29 de 29 SP completados (100 %). De las 20 tareas E2-xx de documentación y entrega, diez están hechas (E2-05 con la salvedad de que el burndown no se actualizó a diario), dos parciales, dos en curso y seis pendientes por depender de datos del cliente o del cierre de la entrega (sección 8). El reparto final de puntos fue de 5 a 7 SP por persona.</w:t>
       </w:r>
     </w:p>
     <w:p>
@@ -11574,7 +11574,7 @@
         <w:t>Sprint Review (24/10/2026).</w:t>
       </w:r>
       <w:r>
-        <w:t xml:space="preserve"> Se revisó el incremento sobre el servidor compartido: la portada (40 aniversario, accesos, noticias con filtros, eventos, «Nuestro trabajo», galería, buscador y pasos del buzón), la participación (calendario, convocatorias de votación y mediación), la atención al estudiante (buzón con código de seguimiento, panel de tickets con filtros, preguntas frecuentes y aviso de privacidad) y la administración (menús por rol, panel de inicio y cuentas institucionales). Queda por validar con el cliente, a través de Miguel Ángel, los textos reales, los objetivos de «Nuestro trabajo» (proceden de la web oficial y son de 2024) y la lista de cuentas de las delegaciones.</w:t>
+        <w:t xml:space="preserve"> Se revisó el incremento sobre el servidor compartido: la portada (40 aniversario, accesos, noticias con filtros, eventos, «Nuestro trabajo», galería, buscador y pasos del buzón), la participación (calendario, convocatorias de votación y mediación), la atención al estudiante (buzón con código de seguimiento, panel de tickets con filtros, preguntas frecuentes y aviso de privacidad) y la administración (menús por rol, panel de inicio y cuentas del CADUS y de los delegados). Queda por validar con el cliente, a través de Miguel Ángel, los textos reales, los objetivos de «Nuestro trabajo» (proceden de la web oficial y son de 2024) y la lista de cuentas de las delegaciones.</w:t>
       </w:r>
     </w:p>
     <w:p>
@@ -12310,7 +12310,7 @@
               <w:rPr>
                 <w:sz w:val="16"/>
               </w:rPr>
-              <w:t>Plan y ejecución de pruebas por rol (PR #32 pendiente de fusionar)</w:t>
+              <w:t>Plan y ejecución de pruebas por rol (PR #32, fusionada el 25/10)</w:t>
             </w:r>
           </w:p>
         </w:tc>
@@ -12468,7 +12468,7 @@
           <w:b w:val="0"/>
           <w:i w:val="0"/>
         </w:rPr>
-        <w:t>Los requisitos se han recogido en REMUS (fichero CADUS.rem, versión 2.0 del 24/10/2026) con la estructura de cinco dimensiones: información, interfaz, funcionales, no funcionales y reglas de negocio. Cada requisito lleva su código de trazabilidad, que se repite en el análisis, el diseño y las capturas. La versión 2.0 recoge las decisiones del Sprint 2: tickets con el módulo propio del buzón, mediación con referencia MED-AAAA-NNNNN, votaciones vinculadas a una asamblea, cuentas institucionales (una del CADUS y una por delegación), privacidad ampliada a las mediaciones, requisitos de interfaz del calendario, la mediación y el panel por rol, y dos casos de uso nuevos. El documento generado por REMUS se entrega aparte (CADUS-REM-v2.pdf) junto al fichero CADUS.rem; las tablas siguientes son un resumen de su contenido. Una diferencia conocida: el código de ticket (CAD-AAAA-NNNNN) y la referencia de mediación (MED-AAAA-NNNNN) llevan en el portal un sufijo aleatorio de 32 caracteres hexadecimales que el REM aún no recoge; se incorporará al validarlo con el cliente. La entrevista con el CADUS prevista para confirmar los requisitos no se ha realizado: el REM queda marcado como pendiente de validar con el cliente, que incluye el plazo de conservación de los datos, la lista de cuentas reales y el logotipo oficial. La importancia indicada es la asignada en REMUS.</w:t>
+        <w:t>Los requisitos se han recogido en REMUS (fichero CADUS.rem, versión 2.0 del 24/10/2026) con la estructura de cinco dimensiones: información, interfaz, funcionales, no funcionales y reglas de negocio. Cada requisito lleva su código de trazabilidad, que se repite en el análisis, el diseño y las capturas. La versión 2.0 recoge las decisiones del Sprint 2: tickets con el módulo propio del buzón, mediación con referencia MED-AAAA-NNNNN, votaciones vinculadas a una asamblea, una cuenta única del CADUS (dcadus@us.es) que usan todos los miembros de la Ejecutiva y desde la que se da acceso a los delegados, y una cuenta por delegado con su correo de alumno (@alum.us.es), privacidad ampliada a las mediaciones, requisitos de interfaz del calendario, la mediación y el panel por rol, y dos casos de uso nuevos. El documento generado por REMUS se entrega aparte (CADUS-REM-v2.pdf) junto al fichero CADUS.rem; las tablas siguientes son un resumen de su contenido. Una diferencia conocida: el código de ticket (CAD-AAAA-NNNNN) y la referencia de mediación (MED-AAAA-NNNNN) llevan en el portal un sufijo aleatorio de 32 caracteres hexadecimales que el REM aún no recoge; se incorporará al validarlo con el cliente. La entrevista con el CADUS prevista para confirmar los requisitos no se ha realizado: el REM queda marcado como pendiente de validar con el cliente, que incluye el plazo de conservación de los datos, la lista de cuentas reales y el logotipo oficial. La importancia indicada es la asignada en REMUS.</w:t>
       </w:r>
     </w:p>
     <w:p>
@@ -13216,7 +13216,7 @@
               <w:rPr>
                 <w:sz w:val="16"/>
               </w:rPr>
-              <w:t>Nombre de la cuenta (institucional: la del CADUS o la de una delegación); Correo institucional del órgano; Rol: estudiante, delegado, miembro de la Ejecutiva o administrador; Delegación asociada (si es delegado)</w:t>
+              <w:t>Nombre de la cuenta (la única del CADUS o la de un delegado); Correo de acceso: dcadus@us.es para la cuenta del CADUS o el correo de alumno (@alum.us.es) del delegado; Rol: estudiante, delegado, miembro de la Ejecutiva o administrador; Delegación asociada (si es delegado)</w:t>
             </w:r>
           </w:p>
         </w:tc>
@@ -15505,7 +15505,7 @@
               <w:rPr>
                 <w:sz w:val="16"/>
               </w:rPr>
-              <w:t>gestionar roles y permisos diferenciados: anónimo, estudiante, delegado, miembro de la Ejecutiva y administrador, con cuentas institucionales (una del CADUS y una por delegación) en lugar de cuentas personales</w:t>
+              <w:t>gestionar roles y permisos diferenciados: anónimo, estudiante, delegado, miembro de la Ejecutiva y administrador, con una cuenta única del CADUS (dcadus@us.es) que usan todos los miembros de la Ejecutiva y desde la que se da acceso a los delegados, y una cuenta por delegado con su correo de alumno (@alum.us.es)</w:t>
             </w:r>
           </w:p>
         </w:tc>
@@ -15523,7 +15523,7 @@
               <w:rPr>
                 <w:sz w:val="16"/>
               </w:rPr>
-              <w:t>HU-13 · E2-01 (Sprint 2). Lista de cuentas reales pendiente de validar con el CADUS</w:t>
+              <w:t>HU-13 · E2-01 (Sprint 2). Lista de delegados y sus correos pendiente de validar con el CADUS</w:t>
             </w:r>
           </w:p>
         </w:tc>
@@ -16908,7 +16908,7 @@
               <w:rPr>
                 <w:sz w:val="17"/>
               </w:rPr>
-              <w:t>Cada ficha de delegación solo puede ser editada por la cuenta de su delegación o por un administrador.</w:t>
+              <w:t>Cada ficha de delegación solo puede ser editada por la cuenta del delegado de esa delegación o por la cuenta del CADUS (administrador).</w:t>
             </w:r>
           </w:p>
         </w:tc>
@@ -28525,7 +28525,7 @@
               <w:rPr>
                 <w:sz w:val="17"/>
               </w:rPr>
-              <w:t>Menús por rol, escritorio con accesos y pruebas por rol (figura 42, figura 43); la documentación de las pruebas de HU-19c está en la PR #32.</w:t>
+              <w:t>Menús por rol, escritorio con accesos y pruebas por rol (figura 42, figura 43); la documentación de las pruebas de HU-19c y HU-12 está en la carpeta tests/ (PR #32 y #33, fusionadas).</w:t>
             </w:r>
           </w:p>
         </w:tc>
@@ -32539,7 +32539,7 @@
               <w:rPr>
                 <w:sz w:val="16"/>
               </w:rPr>
-              <w:t>Cuentas institucionales: la del CADUS y una por delegación</w:t>
+              <w:t>Cuentas de los delegados (una por delegado, con su correo de alumno)</w:t>
             </w:r>
           </w:p>
         </w:tc>
@@ -32556,7 +32556,7 @@
               <w:rPr>
                 <w:sz w:val="16"/>
               </w:rPr>
-              <w:t>Script y lista listos; las cuentas se crean al cerrar la entrega con los correos reales</w:t>
+              <w:t>La cuenta única del CADUS (dcadus@us.es) ya está creada; las de los delegados se crean con el script cuando el CADUS facilite la lista</w:t>
             </w:r>
           </w:p>
         </w:tc>

</xml_diff>